<commit_message>
7/9 Monitor Status Documentation
</commit_message>
<xml_diff>
--- a/docs/user-guides/manuals/user-manual-soc-analyst-tier1.th.docx
+++ b/docs/user-guides/manuals/user-manual-soc-analyst-tier1.th.docx
@@ -1569,7 +1569,7 @@
                 <w:sz w:val="28"/>
                 <w:szCs w:val="28"/>
               </w:rPr>
-              <w:t xml:space="preserve">งานที่รอคุณดำเนินการ, รายการรับแจ้งด้วยตนเอง, และประวัติ</w:t>
+              <w:t xml:space="preserve">งานที่รอคุณดำเนินการ, เคสที่กำลังเฝ้าระวัง, รายการรับแจ้งด้วยตนเอง, และประวัติ</w:t>
             </w:r>
           </w:p>
         </w:tc>
@@ -2831,6 +2831,56 @@
           <w:sz w:val="32"/>
           <w:szCs w:val="32"/>
         </w:rPr>
+        <w:t xml:space="preserve">หากยังไม่ชัดว่าเป็น Event หรือ Incident และเลือกส่งให้ Tier 2 จะมีช่อง </w:t>
+      </w:r>
+      <w:r>
+        <w:rPr>
+          <w:b/>
+          <w:bCs/>
+          <w:color w:val="1F2D3D"/>
+          <w:sz w:val="32"/>
+          <w:szCs w:val="32"/>
+        </w:rPr>
+        <w:t xml:space="preserve">แนะนำให้เฝ้าระวัง (Monitoring)</w:t>
+      </w:r>
+      <w:r>
+        <w:rPr>
+          <w:sz w:val="32"/>
+          <w:szCs w:val="32"/>
+        </w:rPr>
+        <w:t xml:space="preserve"> ให้ติ๊กได้ — เป็นเพียง </w:t>
+      </w:r>
+      <w:r>
+        <w:rPr>
+          <w:b/>
+          <w:bCs/>
+          <w:sz w:val="32"/>
+          <w:szCs w:val="32"/>
+        </w:rPr>
+        <w:t xml:space="preserve">คำแนะนำ</w:t>
+      </w:r>
+      <w:r>
+        <w:rPr>
+          <w:sz w:val="32"/>
+          <w:szCs w:val="32"/>
+        </w:rPr>
+        <w:t xml:space="preserve"> ผู้ตัดสินใจเฝ้าระวังจริงคือ Tier 2 (ดู 5.6)</w:t>
+      </w:r>
+    </w:p>
+    <w:p>
+      <w:pPr>
+        <w:pStyle w:val="ListParagraph"/>
+        <w:numPr>
+          <w:ilvl w:val="0"/>
+          <w:numId w:val="6"/>
+        </w:numPr>
+        <w:spacing w:after="80"/>
+      </w:pPr>
+      <w:r>
+        <w:rPr>
+          <w:sz w:val="32"/>
+          <w:szCs w:val="32"/>
+        </w:rPr>
         <w:t xml:space="preserve">กรอกรายละเอียด: ความรุนแรง วันเวลาที่ตรวจพบ ระบบ/บริการ IP รายละเอียดเหตุการณ์ ฯลฯ</w:t>
       </w:r>
     </w:p>
@@ -3271,7 +3321,7 @@
         <w:pStyle w:val="Heading2"/>
       </w:pPr>
       <w:r>
-        <w:t xml:space="preserve">ตัวอย่างเส้นทาง Incident เต็มรูปแบบ</w:t>
+        <w:t xml:space="preserve">5.6 ดำเนินการต่อเมื่อเคสอยู่ในการเฝ้าระวัง (Monitoring)</w:t>
       </w:r>
     </w:p>
     <w:p>
@@ -3283,7 +3333,69 @@
           <w:sz w:val="32"/>
           <w:szCs w:val="32"/>
         </w:rPr>
-        <w:t xml:space="preserve">สมมติมีการแจ้งเตือนพบมัลแวร์บนเซิร์ฟเวอร์:</w:t>
+        <w:t xml:space="preserve">เมื่อ Tier 2 เห็นว่าเคสยังไม่ชัดว่าเป็น Event หรือ Incident เขาจะกด “เฝ้าระวัง 30 วัน” เคสจะกลับมาอยู่กับคุณ (ผู้เปิดตั๋ว) ที่สถานะ </w:t>
+      </w:r>
+      <w:r>
+        <w:rPr>
+          <w:b/>
+          <w:bCs/>
+          <w:sz w:val="32"/>
+          <w:szCs w:val="32"/>
+        </w:rPr>
+        <w:t xml:space="preserve">กำลังเฝ้าระวัง</w:t>
+      </w:r>
+      <w:r>
+        <w:rPr>
+          <w:sz w:val="32"/>
+          <w:szCs w:val="32"/>
+        </w:rPr>
+        <w:t xml:space="preserve"> และปรากฏในแท็บ </w:t>
+      </w:r>
+      <w:r>
+        <w:rPr>
+          <w:b/>
+          <w:bCs/>
+          <w:color w:val="1F2D3D"/>
+          <w:sz w:val="32"/>
+          <w:szCs w:val="32"/>
+        </w:rPr>
+        <w:t xml:space="preserve">กำลังเฝ้าระวัง</w:t>
+      </w:r>
+      <w:r>
+        <w:rPr>
+          <w:sz w:val="32"/>
+          <w:szCs w:val="32"/>
+        </w:rPr>
+        <w:t xml:space="preserve"> ของ </w:t>
+      </w:r>
+      <w:r>
+        <w:rPr>
+          <w:b/>
+          <w:bCs/>
+          <w:color w:val="245EA8"/>
+          <w:sz w:val="32"/>
+          <w:szCs w:val="32"/>
+        </w:rPr>
+        <w:t xml:space="preserve">My Queue</w:t>
+      </w:r>
+      <w:r>
+        <w:rPr>
+          <w:sz w:val="32"/>
+          <w:szCs w:val="32"/>
+        </w:rPr>
+        <w:t xml:space="preserve"> พร้อมตัวนับถอยหลัง (เขียว → เหลืองเมื่อใกล้ครบ → แดงเมื่อครบกำหนด)</w:t>
+      </w:r>
+    </w:p>
+    <w:p>
+      <w:pPr>
+        <w:spacing w:after="120"/>
+      </w:pPr>
+      <w:r>
+        <w:rPr>
+          <w:sz w:val="32"/>
+          <w:szCs w:val="32"/>
+        </w:rPr>
+        <w:t xml:space="preserve">ระหว่างนี้เพียงเฝ้าติดตาม ไม่ต้องทำอะไรจนกว่าจะครบกำหนดหรือมีเหตุเกิดขึ้น จากนั้นเปิดตั๋วแล้วสรุปผลด้วยการ์ด “สรุปผลการเฝ้าระวัง”:</w:t>
       </w:r>
     </w:p>
     <w:p>
@@ -3297,19 +3409,27 @@
       </w:pPr>
       <w:r>
         <w:rPr>
+          <w:sz w:val="32"/>
+          <w:szCs w:val="32"/>
+        </w:rPr>
+        <w:t xml:space="preserve">มีเหตุการณ์เกิดขึ้นระหว่างเฝ้าระวัง → กด </w:t>
+      </w:r>
+      <w:r>
+        <w:rPr>
           <w:b/>
           <w:bCs/>
-          <w:sz w:val="32"/>
-          <w:szCs w:val="32"/>
-        </w:rPr>
-        <w:t xml:space="preserve">Tier 1</w:t>
-      </w:r>
-      <w:r>
-        <w:rPr>
-          <w:sz w:val="32"/>
-          <w:szCs w:val="32"/>
-        </w:rPr>
-        <w:t xml:space="preserve"> รับ Alert สร้างตั๋ว จัดเป็น Incident และมอบหมายผู้ดูแลระบบ</w:t>
+          <w:color w:val="1F2D3D"/>
+          <w:sz w:val="32"/>
+          <w:szCs w:val="32"/>
+        </w:rPr>
+        <w:t xml:space="preserve">มีเหตุการณ์ → ออกเป็น Incident</w:t>
+      </w:r>
+      <w:r>
+        <w:rPr>
+          <w:sz w:val="32"/>
+          <w:szCs w:val="32"/>
+        </w:rPr>
+        <w:t xml:space="preserve"> (ส่งผู้จัดการ SOC ตรวจก่อนมอบหมาย)</w:t>
       </w:r>
     </w:p>
     <w:p>
@@ -3323,88 +3443,27 @@
       </w:pPr>
       <w:r>
         <w:rPr>
+          <w:sz w:val="32"/>
+          <w:szCs w:val="32"/>
+        </w:rPr>
+        <w:t xml:space="preserve">ครบกำหนด 30 วันและไม่มีเหตุ → กด </w:t>
+      </w:r>
+      <w:r>
+        <w:rPr>
           <w:b/>
           <w:bCs/>
-          <w:sz w:val="32"/>
-          <w:szCs w:val="32"/>
-        </w:rPr>
-        <w:t xml:space="preserve">ผู้จัดการ SOC</w:t>
-      </w:r>
-      <w:r>
-        <w:rPr>
-          <w:sz w:val="32"/>
-          <w:szCs w:val="32"/>
-        </w:rPr>
-        <w:t xml:space="preserve"> ตรวจก่อนมอบหมาย ประเมินฉุกเฉิน แล้วส่งต่อ</w:t>
-      </w:r>
-    </w:p>
-    <w:p>
-      <w:pPr>
-        <w:pStyle w:val="ListParagraph"/>
-        <w:numPr>
-          <w:ilvl w:val="0"/>
-          <w:numId w:val="9"/>
-        </w:numPr>
-        <w:spacing w:after="80"/>
-      </w:pPr>
-      <w:r>
-        <w:rPr>
-          <w:b/>
-          <w:bCs/>
-          <w:sz w:val="32"/>
-          <w:szCs w:val="32"/>
-        </w:rPr>
-        <w:t xml:space="preserve">ผู้ดูแลระบบ</w:t>
-      </w:r>
-      <w:r>
-        <w:rPr>
-          <w:sz w:val="32"/>
-          <w:szCs w:val="32"/>
-        </w:rPr>
-        <w:t xml:space="preserve"> เข้าควบคุม (แยกเครื่อง/ลบมัลแวร์) แล้วส่งรายงานการควบคุม</w:t>
-      </w:r>
-    </w:p>
-    <w:p>
-      <w:pPr>
-        <w:pStyle w:val="ListParagraph"/>
-        <w:numPr>
-          <w:ilvl w:val="0"/>
-          <w:numId w:val="9"/>
-        </w:numPr>
-        <w:spacing w:after="80"/>
-      </w:pPr>
-      <w:r>
-        <w:rPr>
-          <w:b/>
-          <w:bCs/>
-          <w:sz w:val="32"/>
-          <w:szCs w:val="32"/>
-        </w:rPr>
-        <w:t xml:space="preserve">Tier 2</w:t>
-      </w:r>
-      <w:r>
-        <w:rPr>
-          <w:sz w:val="32"/>
-          <w:szCs w:val="32"/>
-        </w:rPr>
-        <w:t xml:space="preserve"> ตรวจรับรายงาน แล้วปิดงาน (หรือส่งผู้จัดการอนุมัติหากฉุกเฉิน)</w:t>
-      </w:r>
-    </w:p>
-    <w:p>
-      <w:pPr>
-        <w:pStyle w:val="ListParagraph"/>
-        <w:numPr>
-          <w:ilvl w:val="0"/>
-          <w:numId w:val="9"/>
-        </w:numPr>
-        <w:spacing w:after="80"/>
-      </w:pPr>
-      <w:r>
-        <w:rPr>
-          <w:sz w:val="32"/>
-          <w:szCs w:val="32"/>
-        </w:rPr>
-        <w:t xml:space="preserve">ระบบแจ้งเจ้าของระบบทางอีเมลเมื่อปิดงาน</w:t>
+          <w:color w:val="1F2D3D"/>
+          <w:sz w:val="32"/>
+          <w:szCs w:val="32"/>
+        </w:rPr>
+        <w:t xml:space="preserve">ครบกำหนด/ไม่มีเหตุ → สรุปเป็น Event</w:t>
+      </w:r>
+      <w:r>
+        <w:rPr>
+          <w:sz w:val="32"/>
+          <w:szCs w:val="32"/>
+        </w:rPr>
+        <w:t xml:space="preserve"> (ส่ง Tier 2 ยืนยันปิด)</w:t>
       </w:r>
     </w:p>
     <w:tbl>
@@ -3462,7 +3521,7 @@
                 <w:sz w:val="32"/>
                 <w:szCs w:val="32"/>
               </w:rPr>
-              <w:t xml:space="preserve">หน้ารายละเอียดตั๋วงาน แสดงปุ่มการดำเนินการตามสถานะปัจจุบันและช่องบันทึกการดำเนินการ</w:t>
+              <w:t xml:space="preserve">การ์ดสรุปผลการเฝ้าระวังบนหน้ารายละเอียดตั๋ว พร้อมปุ่มออกเป็น Incident และสรุปเป็น Event</w:t>
             </w:r>
           </w:p>
           <w:p>
@@ -3476,7 +3535,7 @@
                 <w:sz w:val="24"/>
                 <w:szCs w:val="24"/>
               </w:rPr>
-              <w:t xml:space="preserve">SHOT: T1-ticket-detail</w:t>
+              <w:t xml:space="preserve">SHOT: T1-monitoring-conclude</w:t>
             </w:r>
           </w:p>
         </w:tc>
@@ -3496,6 +3555,305 @@
           <w:szCs w:val="28"/>
         </w:rPr>
         <w:t xml:space="preserve">รูปที่ 5-4  </w:t>
+      </w:r>
+      <w:r>
+        <w:rPr>
+          <w:i/>
+          <w:iCs/>
+          <w:color w:val="6C7888"/>
+          <w:sz w:val="28"/>
+          <w:szCs w:val="28"/>
+        </w:rPr>
+        <w:t xml:space="preserve">การ์ดสรุปผลการเฝ้าระวังบนหน้ารายละเอียดตั๋ว พร้อมปุ่มออกเป็น Incident และสรุปเป็น Event</w:t>
+      </w:r>
+    </w:p>
+    <w:tbl>
+      <w:tblPr>
+        <w:tblW w:type="dxa" w:w="9600"/>
+        <w:tblBorders>
+          <w:top w:val="single" w:color="F1F3F6" w:sz="2"/>
+          <w:left w:val="single" w:color="6C7888" w:sz="28"/>
+          <w:bottom w:val="single" w:color="F1F3F6" w:sz="2"/>
+          <w:right w:val="single" w:color="F1F3F6" w:sz="2"/>
+          <w:insideH w:val="single" w:color="auto" w:sz="4"/>
+          <w:insideV w:val="single" w:color="auto" w:sz="4"/>
+        </w:tblBorders>
+      </w:tblPr>
+      <w:tblGrid>
+        <w:gridCol w:w="9600"/>
+      </w:tblGrid>
+      <w:tr>
+        <w:tc>
+          <w:tcPr>
+            <w:tcW w:type="dxa" w:w="9600"/>
+            <w:shd w:fill="F1F3F6" w:color="auto" w:val="clear"/>
+            <w:tcMar>
+              <w:top w:type="dxa" w:w="140"/>
+              <w:left w:type="dxa" w:w="200"/>
+              <w:bottom w:type="dxa" w:w="140"/>
+              <w:right w:type="dxa" w:w="200"/>
+            </w:tcMar>
+          </w:tcPr>
+          <w:p>
+            <w:pPr>
+              <w:spacing w:after="60"/>
+            </w:pPr>
+            <w:r>
+              <w:rPr>
+                <w:b/>
+                <w:bCs/>
+                <w:color w:val="6C7888"/>
+                <w:sz w:val="30"/>
+                <w:szCs w:val="30"/>
+              </w:rPr>
+              <w:t xml:space="preserve">สิ่งที่ต้องจำ</w:t>
+            </w:r>
+          </w:p>
+          <w:p>
+            <w:pPr>
+              <w:spacing w:after="0"/>
+            </w:pPr>
+            <w:r>
+              <w:rPr>
+                <w:sz w:val="32"/>
+                <w:szCs w:val="32"/>
+              </w:rPr>
+              <w:t xml:space="preserve">เฝ้าระวังได้ครั้งเดียวต่อเคส (30 วันคือกำหนดสูงสุด ขยายไม่ได้) และระหว่างเฝ้าระวังยังตั้งแฟล็กฉุกเฉินไม่ได้ เพราะเคสยังไม่ถูกจัดประเภท</w:t>
+            </w:r>
+          </w:p>
+        </w:tc>
+      </w:tr>
+    </w:tbl>
+    <w:p>
+      <w:pPr>
+        <w:pStyle w:val="Heading2"/>
+      </w:pPr>
+      <w:r>
+        <w:t xml:space="preserve">ตัวอย่างเส้นทาง Incident เต็มรูปแบบ</w:t>
+      </w:r>
+    </w:p>
+    <w:p>
+      <w:pPr>
+        <w:spacing w:after="120"/>
+      </w:pPr>
+      <w:r>
+        <w:rPr>
+          <w:sz w:val="32"/>
+          <w:szCs w:val="32"/>
+        </w:rPr>
+        <w:t xml:space="preserve">สมมติมีการแจ้งเตือนพบมัลแวร์บนเซิร์ฟเวอร์:</w:t>
+      </w:r>
+    </w:p>
+    <w:p>
+      <w:pPr>
+        <w:pStyle w:val="ListParagraph"/>
+        <w:numPr>
+          <w:ilvl w:val="0"/>
+          <w:numId w:val="10"/>
+        </w:numPr>
+        <w:spacing w:after="80"/>
+      </w:pPr>
+      <w:r>
+        <w:rPr>
+          <w:b/>
+          <w:bCs/>
+          <w:sz w:val="32"/>
+          <w:szCs w:val="32"/>
+        </w:rPr>
+        <w:t xml:space="preserve">Tier 1</w:t>
+      </w:r>
+      <w:r>
+        <w:rPr>
+          <w:sz w:val="32"/>
+          <w:szCs w:val="32"/>
+        </w:rPr>
+        <w:t xml:space="preserve"> รับ Alert สร้างตั๋ว จัดเป็น Incident และมอบหมายผู้ดูแลระบบ</w:t>
+      </w:r>
+    </w:p>
+    <w:p>
+      <w:pPr>
+        <w:pStyle w:val="ListParagraph"/>
+        <w:numPr>
+          <w:ilvl w:val="0"/>
+          <w:numId w:val="10"/>
+        </w:numPr>
+        <w:spacing w:after="80"/>
+      </w:pPr>
+      <w:r>
+        <w:rPr>
+          <w:b/>
+          <w:bCs/>
+          <w:sz w:val="32"/>
+          <w:szCs w:val="32"/>
+        </w:rPr>
+        <w:t xml:space="preserve">ผู้จัดการ SOC</w:t>
+      </w:r>
+      <w:r>
+        <w:rPr>
+          <w:sz w:val="32"/>
+          <w:szCs w:val="32"/>
+        </w:rPr>
+        <w:t xml:space="preserve"> ตรวจก่อนมอบหมาย ประเมินฉุกเฉิน แล้วส่งต่อ</w:t>
+      </w:r>
+    </w:p>
+    <w:p>
+      <w:pPr>
+        <w:pStyle w:val="ListParagraph"/>
+        <w:numPr>
+          <w:ilvl w:val="0"/>
+          <w:numId w:val="10"/>
+        </w:numPr>
+        <w:spacing w:after="80"/>
+      </w:pPr>
+      <w:r>
+        <w:rPr>
+          <w:b/>
+          <w:bCs/>
+          <w:sz w:val="32"/>
+          <w:szCs w:val="32"/>
+        </w:rPr>
+        <w:t xml:space="preserve">ผู้ดูแลระบบ</w:t>
+      </w:r>
+      <w:r>
+        <w:rPr>
+          <w:sz w:val="32"/>
+          <w:szCs w:val="32"/>
+        </w:rPr>
+        <w:t xml:space="preserve"> เข้าควบคุม (แยกเครื่อง/ลบมัลแวร์) แล้วส่งรายงานการควบคุม</w:t>
+      </w:r>
+    </w:p>
+    <w:p>
+      <w:pPr>
+        <w:pStyle w:val="ListParagraph"/>
+        <w:numPr>
+          <w:ilvl w:val="0"/>
+          <w:numId w:val="10"/>
+        </w:numPr>
+        <w:spacing w:after="80"/>
+      </w:pPr>
+      <w:r>
+        <w:rPr>
+          <w:b/>
+          <w:bCs/>
+          <w:sz w:val="32"/>
+          <w:szCs w:val="32"/>
+        </w:rPr>
+        <w:t xml:space="preserve">Tier 2</w:t>
+      </w:r>
+      <w:r>
+        <w:rPr>
+          <w:sz w:val="32"/>
+          <w:szCs w:val="32"/>
+        </w:rPr>
+        <w:t xml:space="preserve"> ตรวจรับรายงาน แล้วปิดงาน (หรือส่งผู้จัดการอนุมัติหากฉุกเฉิน)</w:t>
+      </w:r>
+    </w:p>
+    <w:p>
+      <w:pPr>
+        <w:pStyle w:val="ListParagraph"/>
+        <w:numPr>
+          <w:ilvl w:val="0"/>
+          <w:numId w:val="10"/>
+        </w:numPr>
+        <w:spacing w:after="80"/>
+      </w:pPr>
+      <w:r>
+        <w:rPr>
+          <w:sz w:val="32"/>
+          <w:szCs w:val="32"/>
+        </w:rPr>
+        <w:t xml:space="preserve">ระบบแจ้งเจ้าของระบบทางอีเมลเมื่อปิดงาน</w:t>
+      </w:r>
+    </w:p>
+    <w:tbl>
+      <w:tblPr>
+        <w:tblW w:type="dxa" w:w="9600"/>
+        <w:tblBorders>
+          <w:top w:val="dashed" w:color="9DB4D4" w:sz="6"/>
+          <w:left w:val="dashed" w:color="9DB4D4" w:sz="6"/>
+          <w:bottom w:val="dashed" w:color="9DB4D4" w:sz="6"/>
+          <w:right w:val="dashed" w:color="9DB4D4" w:sz="6"/>
+          <w:insideH w:val="single" w:color="auto" w:sz="4"/>
+          <w:insideV w:val="single" w:color="auto" w:sz="4"/>
+        </w:tblBorders>
+      </w:tblPr>
+      <w:tblGrid>
+        <w:gridCol w:w="9600"/>
+      </w:tblGrid>
+      <w:tr>
+        <w:tc>
+          <w:tcPr>
+            <w:tcW w:type="dxa" w:w="9600"/>
+            <w:shd w:fill="F7F8FA" w:color="auto" w:val="clear"/>
+            <w:tcMar>
+              <w:top w:type="dxa" w:w="520"/>
+              <w:left w:type="dxa" w:w="200"/>
+              <w:bottom w:type="dxa" w:w="520"/>
+              <w:right w:type="dxa" w:w="200"/>
+            </w:tcMar>
+            <w:vAlign w:val="center"/>
+          </w:tcPr>
+          <w:p>
+            <w:pPr>
+              <w:spacing w:after="40"/>
+              <w:jc w:val="center"/>
+            </w:pPr>
+            <w:r>
+              <w:rPr>
+                <w:b/>
+                <w:bCs/>
+                <w:color w:val="6C7888"/>
+                <w:sz w:val="30"/>
+                <w:szCs w:val="30"/>
+              </w:rPr>
+              <w:t xml:space="preserve">[ ตำแหน่งภาพหน้าจอ ]</w:t>
+            </w:r>
+          </w:p>
+          <w:p>
+            <w:pPr>
+              <w:spacing w:after="40"/>
+              <w:jc w:val="center"/>
+            </w:pPr>
+            <w:r>
+              <w:rPr>
+                <w:color w:val="1F2D3D"/>
+                <w:sz w:val="32"/>
+                <w:szCs w:val="32"/>
+              </w:rPr>
+              <w:t xml:space="preserve">หน้ารายละเอียดตั๋วงาน แสดงปุ่มการดำเนินการตามสถานะปัจจุบันและช่องบันทึกการดำเนินการ</w:t>
+            </w:r>
+          </w:p>
+          <w:p>
+            <w:pPr>
+              <w:jc w:val="center"/>
+            </w:pPr>
+            <w:r>
+              <w:rPr>
+                <w:rFonts w:ascii="Consolas" w:cs="Consolas" w:eastAsia="Consolas" w:hAnsi="Consolas"/>
+                <w:color w:val="9AA6B4"/>
+                <w:sz w:val="24"/>
+                <w:szCs w:val="24"/>
+              </w:rPr>
+              <w:t xml:space="preserve">SHOT: T1-ticket-detail</w:t>
+            </w:r>
+          </w:p>
+        </w:tc>
+      </w:tr>
+    </w:tbl>
+    <w:p>
+      <w:pPr>
+        <w:spacing w:after="160" w:before="60"/>
+        <w:jc w:val="center"/>
+      </w:pPr>
+      <w:r>
+        <w:rPr>
+          <w:b/>
+          <w:bCs/>
+          <w:color w:val="245EA8"/>
+          <w:sz w:val="28"/>
+          <w:szCs w:val="28"/>
+        </w:rPr>
+        <w:t xml:space="preserve">รูปที่ 5-5  </w:t>
       </w:r>
       <w:r>
         <w:rPr>
@@ -3884,7 +4242,7 @@
                 <w:sz w:val="28"/>
                 <w:szCs w:val="28"/>
               </w:rPr>
-              <w:t xml:space="preserve">รอ Tier 1 ทบทวน</w:t>
+              <w:t xml:space="preserve">กำลังเฝ้าระวัง</w:t>
             </w:r>
             <w:r>
               <w:rPr>
@@ -3894,7 +4252,7 @@
                 <w:szCs w:val="24"/>
               </w:rPr>
               <w:br/>
-              <w:t xml:space="preserve">T1_REVIEW</w:t>
+              <w:t xml:space="preserve">MONITORING</w:t>
             </w:r>
           </w:p>
         </w:tc>
@@ -3918,7 +4276,7 @@
                 <w:sz w:val="28"/>
                 <w:szCs w:val="28"/>
               </w:rPr>
-              <w:t xml:space="preserve">Tier 2 ยืนยัน Incident แล้วส่งกลับ</w:t>
+              <w:t xml:space="preserve">Tier 2 ให้เฝ้าระวัง 30 วัน (ยังไม่ชี้ขาด)</w:t>
             </w:r>
           </w:p>
         </w:tc>
@@ -3942,7 +4300,7 @@
                 <w:sz w:val="28"/>
                 <w:szCs w:val="28"/>
               </w:rPr>
-              <w:t xml:space="preserve">เลือกเส้นทางการจัดการ (ดู 5.4)</w:t>
+              <w:t xml:space="preserve">เฝ้าติดตาม เมื่อครบกำหนด/มีเหตุ สรุปเป็น Event หรือ Incident (ดู 5.6)</w:t>
             </w:r>
           </w:p>
         </w:tc>
@@ -3973,7 +4331,7 @@
                 <w:sz w:val="28"/>
                 <w:szCs w:val="28"/>
               </w:rPr>
-              <w:t xml:space="preserve">รอเจ้าของระบบ</w:t>
+              <w:t xml:space="preserve">รอ Tier 1 ทบทวน</w:t>
             </w:r>
             <w:r>
               <w:rPr>
@@ -3983,7 +4341,7 @@
                 <w:szCs w:val="24"/>
               </w:rPr>
               <w:br/>
-              <w:t xml:space="preserve">AWAITING_OWNER</w:t>
+              <w:t xml:space="preserve">T1_REVIEW</w:t>
             </w:r>
           </w:p>
         </w:tc>
@@ -4007,7 +4365,7 @@
                 <w:sz w:val="28"/>
                 <w:szCs w:val="28"/>
               </w:rPr>
-              <w:t xml:space="preserve">เจ้าของระบบกำลังแก้ไขเอง</w:t>
+              <w:t xml:space="preserve">Tier 2 ยืนยัน Incident แล้วส่งกลับ</w:t>
             </w:r>
           </w:p>
         </w:tc>
@@ -4031,7 +4389,7 @@
                 <w:sz w:val="28"/>
                 <w:szCs w:val="28"/>
               </w:rPr>
-              <w:t xml:space="preserve">ติดตาม แล้วบันทึกผล+ส่ง Tier 2 (ดู 5.5)</w:t>
+              <w:t xml:space="preserve">เลือกเส้นทางการจัดการ (ดู 5.4)</w:t>
             </w:r>
           </w:p>
         </w:tc>
@@ -4062,7 +4420,7 @@
                 <w:sz w:val="28"/>
                 <w:szCs w:val="28"/>
               </w:rPr>
-              <w:t xml:space="preserve">รอ Tier 2 ตรวจสอบ</w:t>
+              <w:t xml:space="preserve">รอเจ้าของระบบ</w:t>
             </w:r>
             <w:r>
               <w:rPr>
@@ -4072,7 +4430,7 @@
                 <w:szCs w:val="24"/>
               </w:rPr>
               <w:br/>
-              <w:t xml:space="preserve">PENDING_T2_REVIEW</w:t>
+              <w:t xml:space="preserve">AWAITING_OWNER</w:t>
             </w:r>
           </w:p>
         </w:tc>
@@ -4096,7 +4454,7 @@
                 <w:sz w:val="28"/>
                 <w:szCs w:val="28"/>
               </w:rPr>
-              <w:t xml:space="preserve">ส่งเข้าคิวตรวจรับของ Tier 2 แล้ว</w:t>
+              <w:t xml:space="preserve">เจ้าของระบบกำลังแก้ไขเอง</w:t>
             </w:r>
           </w:p>
         </w:tc>
@@ -4104,6 +4462,95 @@
           <w:tcPr>
             <w:tcW w:type="dxa" w:w="3600"/>
             <w:shd w:fill="FFFFFF" w:color="auto" w:val="clear"/>
+            <w:tcMar>
+              <w:top w:type="dxa" w:w="70"/>
+              <w:left w:type="dxa" w:w="120"/>
+              <w:bottom w:type="dxa" w:w="70"/>
+              <w:right w:type="dxa" w:w="120"/>
+            </w:tcMar>
+          </w:tcPr>
+          <w:p>
+            <w:pPr>
+              <w:spacing w:after="0"/>
+            </w:pPr>
+            <w:r>
+              <w:rPr>
+                <w:sz w:val="28"/>
+                <w:szCs w:val="28"/>
+              </w:rPr>
+              <w:t xml:space="preserve">ติดตาม แล้วบันทึกผล+ส่ง Tier 2 (ดู 5.5)</w:t>
+            </w:r>
+          </w:p>
+        </w:tc>
+      </w:tr>
+      <w:tr>
+        <w:trPr>
+          <w:cantSplit/>
+        </w:trPr>
+        <w:tc>
+          <w:tcPr>
+            <w:tcW w:type="dxa" w:w="2600"/>
+            <w:shd w:fill="F7F8FA" w:color="auto" w:val="clear"/>
+            <w:tcMar>
+              <w:top w:type="dxa" w:w="70"/>
+              <w:left w:type="dxa" w:w="120"/>
+              <w:bottom w:type="dxa" w:w="70"/>
+              <w:right w:type="dxa" w:w="120"/>
+            </w:tcMar>
+          </w:tcPr>
+          <w:p>
+            <w:pPr>
+              <w:spacing w:after="0"/>
+            </w:pPr>
+            <w:r>
+              <w:rPr>
+                <w:b/>
+                <w:bCs/>
+                <w:sz w:val="28"/>
+                <w:szCs w:val="28"/>
+              </w:rPr>
+              <w:t xml:space="preserve">รอ Tier 2 ตรวจสอบ</w:t>
+            </w:r>
+            <w:r>
+              <w:rPr>
+                <w:rFonts w:ascii="Consolas" w:cs="Consolas" w:eastAsia="Consolas" w:hAnsi="Consolas"/>
+                <w:color w:val="6C7888"/>
+                <w:sz w:val="24"/>
+                <w:szCs w:val="24"/>
+              </w:rPr>
+              <w:br/>
+              <w:t xml:space="preserve">PENDING_T2_REVIEW</w:t>
+            </w:r>
+          </w:p>
+        </w:tc>
+        <w:tc>
+          <w:tcPr>
+            <w:tcW w:type="dxa" w:w="3400"/>
+            <w:shd w:fill="F7F8FA" w:color="auto" w:val="clear"/>
+            <w:tcMar>
+              <w:top w:type="dxa" w:w="70"/>
+              <w:left w:type="dxa" w:w="120"/>
+              <w:bottom w:type="dxa" w:w="70"/>
+              <w:right w:type="dxa" w:w="120"/>
+            </w:tcMar>
+          </w:tcPr>
+          <w:p>
+            <w:pPr>
+              <w:spacing w:after="0"/>
+            </w:pPr>
+            <w:r>
+              <w:rPr>
+                <w:sz w:val="28"/>
+                <w:szCs w:val="28"/>
+              </w:rPr>
+              <w:t xml:space="preserve">ส่งเข้าคิวตรวจรับของ Tier 2 แล้ว</w:t>
+            </w:r>
+          </w:p>
+        </w:tc>
+        <w:tc>
+          <w:tcPr>
+            <w:tcW w:type="dxa" w:w="3600"/>
+            <w:shd w:fill="F7F8FA" w:color="auto" w:val="clear"/>
             <w:tcMar>
               <w:top w:type="dxa" w:w="70"/>
               <w:left w:type="dxa" w:w="120"/>
@@ -5301,6 +5748,24 @@
     </w:lvl>
   </w:abstractNum>
   <w:abstractNum w:abstractNumId="9" w15:restartNumberingAfterBreak="0">
+    <w:multiLevelType w:val="hybridMultilevel"/>
+    <w:lvl w:ilvl="0" w15:tentative="1">
+      <w:start w:val="1"/>
+      <w:numFmt w:val="decimal"/>
+      <w:lvlText w:val="%1."/>
+      <w:lvlJc w:val="start"/>
+      <w:pPr>
+        <w:ind w:left="460" w:hanging="300"/>
+      </w:pPr>
+      <w:rPr>
+        <w:rFonts w:ascii="TH Sarabun New" w:cs="TH Sarabun New" w:eastAsia="TH Sarabun New" w:hAnsi="TH Sarabun New"/>
+        <w:b/>
+        <w:bCs/>
+        <w:color w:val="245EA8"/>
+      </w:rPr>
+    </w:lvl>
+  </w:abstractNum>
+  <w:abstractNum w:abstractNumId="10" w15:restartNumberingAfterBreak="0">
     <w:multiLevelType w:val="hybridMultilevel"/>
     <w:lvl w:ilvl="0" w15:tentative="1">
       <w:start w:val="1"/>
@@ -5367,6 +5832,12 @@
     </w:lvlOverride>
   </w:num>
   <w:num w:numId="9">
+    <w:abstractNumId w:val="10"/>
+    <w:lvlOverride w:ilvl="0">
+      <w:startOverride w:val="1"/>
+    </w:lvlOverride>
+  </w:num>
+  <w:num w:numId="10">
     <w:abstractNumId w:val="9"/>
     <w:lvlOverride w:ilvl="0">
       <w:startOverride w:val="1"/>

</xml_diff>